<commit_message>
vault backup: 2026-09-15 06:00:31
</commit_message>
<xml_diff>
--- a/output/20260915歴代誌第一7-1-9-34 「捕囚で終わらない名簿」（早天12分）.docx
+++ b/output/20260915歴代誌第一7-1-9-34 「捕囚で終わらない名簿」（早天12分）.docx
@@ -2259,135 +2259,87 @@
           <w:rFonts w:ascii="Meiryo UI" w:hAnsi="Meiryo UI"/>
           <w:sz w:val="21"/>
         </w:rPr>
-        <w:t xml:space="preserve">そして折り返した先を書き継いでいって、イエス様の名にたどり着きます。</w:t>
-      </w:r>
-    </w:p>
-    <w:p>
-      <w:pPr>
-        <w:pStyle w:val="a8"/>
-        <w:rPr>
-          <w:rFonts w:ascii="Meiryo UI" w:hAnsi="Meiryo UI"/>
-          <w:sz w:val="21"/>
-        </w:rPr>
-      </w:pPr>
-      <w:r>
-        <w:rPr>
-          <w:rFonts w:ascii="Meiryo UI" w:hAnsi="Meiryo UI"/>
-          <w:sz w:val="21"/>
-        </w:rPr>
-        <w:t xml:space="preserve">これは本文の外からの補いですが、</w:t>
-      </w:r>
-    </w:p>
-    <w:p>
-      <w:pPr>
-        <w:pStyle w:val="a8"/>
-        <w:rPr>
-          <w:rFonts w:ascii="Meiryo UI" w:hAnsi="Meiryo UI"/>
-          <w:sz w:val="21"/>
-        </w:rPr>
-      </w:pPr>
-      <w:r>
-        <w:rPr>
-          <w:rFonts w:ascii="Meiryo UI" w:hAnsi="Meiryo UI"/>
-          <w:sz w:val="21"/>
-        </w:rPr>
-        <w:t xml:space="preserve">歴代誌がまとめられたのは、この人たちが帰って来た後のことです。</w:t>
-      </w:r>
-    </w:p>
-    <w:p>
-      <w:pPr>
-        <w:pStyle w:val="a8"/>
-        <w:rPr>
-          <w:rFonts w:ascii="Meiryo UI" w:hAnsi="Meiryo UI"/>
-          <w:sz w:val="21"/>
-        </w:rPr>
-      </w:pPr>
-      <w:r>
-        <w:rPr>
-          <w:rFonts w:ascii="Meiryo UI" w:hAnsi="Meiryo UI"/>
-          <w:sz w:val="21"/>
-        </w:rPr>
-        <w:t xml:space="preserve">書いている人自身が、この名簿の続きの中にいました。</w:t>
-      </w:r>
-    </w:p>
-    <w:p>
-      <w:pPr>
-        <w:pStyle w:val="a8"/>
-        <w:rPr>
-          <w:rFonts w:ascii="Meiryo UI" w:hAnsi="Meiryo UI"/>
-          <w:sz w:val="21"/>
-        </w:rPr>
-      </w:pPr>
-      <w:r>
-        <w:rPr>
-          <w:rFonts w:ascii="Meiryo UI" w:hAnsi="Meiryo UI"/>
-          <w:sz w:val="21"/>
-        </w:rPr>
-        <w:t xml:space="preserve">歴代誌第一九章二節で帰って来た人たちは、</w:t>
-      </w:r>
-    </w:p>
-    <w:p>
-      <w:pPr>
-        <w:pStyle w:val="a8"/>
-        <w:rPr>
-          <w:rFonts w:ascii="Meiryo UI" w:hAnsi="Meiryo UI"/>
-          <w:sz w:val="21"/>
-        </w:rPr>
-      </w:pPr>
-      <w:r>
-        <w:rPr>
-          <w:rFonts w:ascii="Meiryo UI" w:hAnsi="Meiryo UI"/>
-          <w:sz w:val="21"/>
-        </w:rPr>
-        <w:t xml:space="preserve">自分たちがその続きのどのあたりに立っているのか、知りませんでした。</w:t>
-      </w:r>
-    </w:p>
-    <w:p>
-      <w:pPr>
-        <w:pStyle w:val="a8"/>
-        <w:rPr>
-          <w:rFonts w:ascii="Meiryo UI" w:hAnsi="Meiryo UI"/>
-          <w:sz w:val="21"/>
-        </w:rPr>
-      </w:pPr>
-      <w:r>
-        <w:rPr>
-          <w:rFonts w:ascii="Meiryo UI" w:hAnsi="Meiryo UI"/>
-          <w:sz w:val="21"/>
-        </w:rPr>
-        <w:t xml:space="preserve">彼らがしていたのは、門を開け、器を数え、パンを並べることでした。</w:t>
-      </w:r>
-    </w:p>
-    <w:p>
-      <w:pPr>
-        <w:pStyle w:val="a8"/>
-        <w:rPr>
-          <w:rFonts w:ascii="Meiryo UI" w:hAnsi="Meiryo UI"/>
-          <w:sz w:val="21"/>
-        </w:rPr>
-      </w:pPr>
-      <w:r>
-        <w:rPr>
-          <w:rFonts w:ascii="Meiryo UI" w:hAnsi="Meiryo UI"/>
-          <w:sz w:val="21"/>
-        </w:rPr>
-        <w:t xml:space="preserve">しかし名簿は、捕囚で終わりませんでした。</w:t>
-      </w:r>
-    </w:p>
-    <w:p>
-      <w:pPr>
-        <w:pStyle w:val="a8"/>
-        <w:rPr>
-          <w:rFonts w:ascii="Meiryo UI" w:hAnsi="Meiryo UI"/>
-          <w:sz w:val="21"/>
-        </w:rPr>
-      </w:pPr>
-      <w:r>
-        <w:rPr>
-          <w:rFonts w:ascii="Meiryo UI" w:hAnsi="Meiryo UI"/>
-          <w:sz w:val="21"/>
-        </w:rPr>
-        <w:t xml:space="preserve">彼らの名前の先に、続きがありました。</w:t>
+        <w:t xml:space="preserve">そして折り返した先を、イエス様の名まで書き継いでいきます。</w:t>
+      </w:r>
+    </w:p>
+    <w:p>
+      <w:pPr>
+        <w:pStyle w:val="a8"/>
+        <w:rPr>
+          <w:rFonts w:ascii="Meiryo UI" w:hAnsi="Meiryo UI"/>
+          <w:sz w:val="21"/>
+        </w:rPr>
+      </w:pPr>
+      <w:r>
+        <w:rPr>
+          <w:rFonts w:ascii="Meiryo UI" w:hAnsi="Meiryo UI"/>
+          <w:sz w:val="21"/>
+        </w:rPr>
+        <w:t xml:space="preserve">歴代誌の名簿は、九章三十四節で終わります。</w:t>
+      </w:r>
+    </w:p>
+    <w:p>
+      <w:pPr>
+        <w:pStyle w:val="a8"/>
+        <w:rPr>
+          <w:rFonts w:ascii="Meiryo UI" w:hAnsi="Meiryo UI"/>
+          <w:sz w:val="21"/>
+        </w:rPr>
+      </w:pPr>
+      <w:r>
+        <w:rPr>
+          <w:rFonts w:ascii="Meiryo UI" w:hAnsi="Meiryo UI"/>
+          <w:sz w:val="21"/>
+        </w:rPr>
+        <w:t xml:space="preserve">そのとき帰って来ていた人たちがしていたのは、門を開け、器を数え、パンを並べることでした。</w:t>
+      </w:r>
+    </w:p>
+    <w:p>
+      <w:pPr>
+        <w:pStyle w:val="a8"/>
+        <w:rPr>
+          <w:rFonts w:ascii="Meiryo UI" w:hAnsi="Meiryo UI"/>
+          <w:sz w:val="21"/>
+        </w:rPr>
+      </w:pPr>
+      <w:r>
+        <w:rPr>
+          <w:rFonts w:ascii="Meiryo UI" w:hAnsi="Meiryo UI"/>
+          <w:sz w:val="21"/>
+        </w:rPr>
+        <w:t xml:space="preserve">この先どうなるのかは、彼らには分かりません。</w:t>
+      </w:r>
+    </w:p>
+    <w:p>
+      <w:pPr>
+        <w:pStyle w:val="a8"/>
+        <w:rPr>
+          <w:rFonts w:ascii="Meiryo UI" w:hAnsi="Meiryo UI"/>
+          <w:sz w:val="21"/>
+        </w:rPr>
+      </w:pPr>
+      <w:r>
+        <w:rPr>
+          <w:rFonts w:ascii="Meiryo UI" w:hAnsi="Meiryo UI"/>
+          <w:sz w:val="21"/>
+        </w:rPr>
+        <w:t xml:space="preserve">しかし、彼らの名前の先に続きがありました。</w:t>
+      </w:r>
+    </w:p>
+    <w:p>
+      <w:pPr>
+        <w:pStyle w:val="a8"/>
+        <w:rPr>
+          <w:rFonts w:ascii="Meiryo UI" w:hAnsi="Meiryo UI"/>
+          <w:sz w:val="21"/>
+        </w:rPr>
+      </w:pPr>
+      <w:r>
+        <w:rPr>
+          <w:rFonts w:ascii="Meiryo UI" w:hAnsi="Meiryo UI"/>
+          <w:sz w:val="21"/>
+        </w:rPr>
+        <w:t xml:space="preserve">マタイが書き継いだのは、その続きです。</w:t>
       </w:r>
     </w:p>
     <w:p>
@@ -2485,55 +2437,55 @@
           <w:rFonts w:ascii="Meiryo UI" w:hAnsi="Meiryo UI"/>
           <w:sz w:val="21"/>
         </w:rPr>
-        <w:t xml:space="preserve">七章の数え方と、九章の数え方があります。</w:t>
-      </w:r>
-    </w:p>
-    <w:p>
-      <w:pPr>
-        <w:pStyle w:val="a8"/>
-        <w:rPr>
-          <w:rFonts w:ascii="Meiryo UI" w:hAnsi="Meiryo UI"/>
-          <w:sz w:val="21"/>
-        </w:rPr>
-      </w:pPr>
-      <w:r>
-        <w:rPr>
-          <w:rFonts w:ascii="Meiryo UI" w:hAnsi="Meiryo UI"/>
-          <w:sz w:val="21"/>
-        </w:rPr>
-        <w:t xml:space="preserve">人に見える力のほうへ心が向くのは、私自身のことでもあります。</w:t>
-      </w:r>
-    </w:p>
-    <w:p>
-      <w:pPr>
-        <w:pStyle w:val="a8"/>
-        <w:rPr>
-          <w:rFonts w:ascii="Meiryo UI" w:hAnsi="Meiryo UI"/>
-          <w:sz w:val="21"/>
-        </w:rPr>
-      </w:pPr>
-      <w:r>
-        <w:rPr>
-          <w:rFonts w:ascii="Meiryo UI" w:hAnsi="Meiryo UI"/>
-          <w:sz w:val="21"/>
-        </w:rPr>
-        <w:t xml:space="preserve">しかし帰って来た民の名簿で数えられていたのは、</w:t>
-      </w:r>
-    </w:p>
-    <w:p>
-      <w:pPr>
-        <w:pStyle w:val="a8"/>
-        <w:rPr>
-          <w:rFonts w:ascii="Meiryo UI" w:hAnsi="Meiryo UI"/>
-          <w:sz w:val="21"/>
-        </w:rPr>
-      </w:pPr>
-      <w:r>
-        <w:rPr>
-          <w:rFonts w:ascii="Meiryo UI" w:hAnsi="Meiryo UI"/>
-          <w:sz w:val="21"/>
-        </w:rPr>
-        <w:t xml:space="preserve">門を守り、器具を数え、パンを用意し、歌う人たちでした。</w:t>
+        <w:t xml:space="preserve">七章では、戦いに出られる人の数が数えられました。</w:t>
+      </w:r>
+    </w:p>
+    <w:p>
+      <w:pPr>
+        <w:pStyle w:val="a8"/>
+        <w:rPr>
+          <w:rFonts w:ascii="Meiryo UI" w:hAnsi="Meiryo UI"/>
+          <w:sz w:val="21"/>
+        </w:rPr>
+      </w:pPr>
+      <w:r>
+        <w:rPr>
+          <w:rFonts w:ascii="Meiryo UI" w:hAnsi="Meiryo UI"/>
+          <w:sz w:val="21"/>
+        </w:rPr>
+        <w:t xml:space="preserve">九章で数えられたのは、門を開ける人、器を数える人、パンを用意する人でした。</w:t>
+      </w:r>
+    </w:p>
+    <w:p>
+      <w:pPr>
+        <w:pStyle w:val="a8"/>
+        <w:rPr>
+          <w:rFonts w:ascii="Meiryo UI" w:hAnsi="Meiryo UI"/>
+          <w:sz w:val="21"/>
+        </w:rPr>
+      </w:pPr>
+      <w:r>
+        <w:rPr>
+          <w:rFonts w:ascii="Meiryo UI" w:hAnsi="Meiryo UI"/>
+          <w:sz w:val="21"/>
+        </w:rPr>
+        <w:t xml:space="preserve">同じ「勇士」ということばが、七章では戦場、九章では神の宮に使われています。</w:t>
+      </w:r>
+    </w:p>
+    <w:p>
+      <w:pPr>
+        <w:pStyle w:val="a8"/>
+        <w:rPr>
+          <w:rFonts w:ascii="Meiryo UI" w:hAnsi="Meiryo UI"/>
+          <w:sz w:val="21"/>
+        </w:rPr>
+      </w:pPr>
+      <w:r>
+        <w:rPr>
+          <w:rFonts w:ascii="Meiryo UI" w:hAnsi="Meiryo UI"/>
+          <w:sz w:val="21"/>
+        </w:rPr>
+        <w:t xml:space="preserve">今朝、自分がどちらの数え方で数えられたいのかを、本文の前に置きたいと思います。</w:t>
       </w:r>
     </w:p>
     <w:p>

</xml_diff>